<commit_message>
some documnet for exhibition
</commit_message>
<xml_diff>
--- a/StS v3/gampadinput.docx
+++ b/StS v3/gampadinput.docx
@@ -4,19 +4,22 @@
   <w:body>
     <w:p>
       <w:r>
+        <w:rPr>
+          <w:noProof/>
+        </w:rPr>
         <w:drawing>
-          <wp:anchor distT="0" distB="0" distL="114300" distR="114300" simplePos="0" relativeHeight="251659264" behindDoc="0" locked="0" layoutInCell="1" allowOverlap="1" wp14:anchorId="1120538B" wp14:editId="22732970">
+          <wp:anchor distT="0" distB="0" distL="114300" distR="114300" simplePos="0" relativeHeight="251660288" behindDoc="0" locked="0" layoutInCell="1" allowOverlap="1" wp14:anchorId="67CDA89A" wp14:editId="26F67E7E">
             <wp:simplePos x="0" y="0"/>
             <wp:positionH relativeFrom="column">
-              <wp:posOffset>304800</wp:posOffset>
+              <wp:posOffset>5295900</wp:posOffset>
             </wp:positionH>
             <wp:positionV relativeFrom="paragraph">
-              <wp:posOffset>406400</wp:posOffset>
+              <wp:posOffset>1562100</wp:posOffset>
             </wp:positionV>
-            <wp:extent cx="4958715" cy="3300730"/>
+            <wp:extent cx="971550" cy="971550"/>
             <wp:effectExtent l="0" t="0" r="0" b="0"/>
             <wp:wrapNone/>
-            <wp:docPr id="786940467" name="Picture 1"/>
+            <wp:docPr id="363504971" name="Picture 5"/>
             <wp:cNvGraphicFramePr>
               <a:graphicFrameLocks xmlns:a="http://schemas.openxmlformats.org/drawingml/2006/main" noChangeAspect="1"/>
             </wp:cNvGraphicFramePr>
@@ -24,8 +27,10 @@
               <a:graphicData uri="http://schemas.openxmlformats.org/drawingml/2006/picture">
                 <pic:pic xmlns:pic="http://schemas.openxmlformats.org/drawingml/2006/picture">
                   <pic:nvPicPr>
-                    <pic:cNvPr id="1736020544" name=""/>
-                    <pic:cNvPicPr/>
+                    <pic:cNvPr id="0" name="Picture 7"/>
+                    <pic:cNvPicPr>
+                      <a:picLocks noChangeAspect="1" noChangeArrowheads="1"/>
+                    </pic:cNvPicPr>
                   </pic:nvPicPr>
                   <pic:blipFill>
                     <a:blip r:embed="rId4">
@@ -35,39 +40,53 @@
                         </a:ext>
                       </a:extLst>
                     </a:blip>
+                    <a:srcRect/>
                     <a:stretch>
                       <a:fillRect/>
                     </a:stretch>
                   </pic:blipFill>
-                  <pic:spPr>
+                  <pic:spPr bwMode="auto">
                     <a:xfrm>
                       <a:off x="0" y="0"/>
-                      <a:ext cx="4958715" cy="3300730"/>
+                      <a:ext cx="971550" cy="971550"/>
                     </a:xfrm>
                     <a:prstGeom prst="rect">
                       <a:avLst/>
                     </a:prstGeom>
+                    <a:noFill/>
+                    <a:ln>
+                      <a:noFill/>
+                    </a:ln>
                   </pic:spPr>
                 </pic:pic>
               </a:graphicData>
             </a:graphic>
+            <wp14:sizeRelH relativeFrom="margin">
+              <wp14:pctWidth>0</wp14:pctWidth>
+            </wp14:sizeRelH>
+            <wp14:sizeRelV relativeFrom="margin">
+              <wp14:pctHeight>0</wp14:pctHeight>
+            </wp14:sizeRelV>
           </wp:anchor>
         </w:drawing>
       </w:r>
       <w:r>
+        <w:rPr>
+          <w:noProof/>
+        </w:rPr>
         <w:drawing>
-          <wp:anchor distT="0" distB="0" distL="114300" distR="114300" simplePos="0" relativeHeight="251658240" behindDoc="0" locked="0" layoutInCell="1" allowOverlap="1" wp14:anchorId="71C0B870" wp14:editId="54384568">
+          <wp:anchor distT="0" distB="0" distL="114300" distR="114300" simplePos="0" relativeHeight="251662336" behindDoc="0" locked="0" layoutInCell="1" allowOverlap="1" wp14:anchorId="66AAEBD6" wp14:editId="635160D7">
             <wp:simplePos x="0" y="0"/>
-            <wp:positionH relativeFrom="margin">
-              <wp:align>center</wp:align>
+            <wp:positionH relativeFrom="column">
+              <wp:posOffset>5229225</wp:posOffset>
             </wp:positionH>
             <wp:positionV relativeFrom="paragraph">
-              <wp:posOffset>5168900</wp:posOffset>
+              <wp:posOffset>6838950</wp:posOffset>
             </wp:positionV>
-            <wp:extent cx="4958715" cy="3300730"/>
+            <wp:extent cx="876300" cy="876300"/>
             <wp:effectExtent l="0" t="0" r="0" b="0"/>
             <wp:wrapNone/>
-            <wp:docPr id="1736020544" name="Picture 1"/>
+            <wp:docPr id="2130654265" name="Picture 5"/>
             <wp:cNvGraphicFramePr>
               <a:graphicFrameLocks xmlns:a="http://schemas.openxmlformats.org/drawingml/2006/main" noChangeAspect="1"/>
             </wp:cNvGraphicFramePr>
@@ -75,8 +94,10 @@
               <a:graphicData uri="http://schemas.openxmlformats.org/drawingml/2006/picture">
                 <pic:pic xmlns:pic="http://schemas.openxmlformats.org/drawingml/2006/picture">
                   <pic:nvPicPr>
-                    <pic:cNvPr id="1736020544" name=""/>
-                    <pic:cNvPicPr/>
+                    <pic:cNvPr id="0" name="Picture 7"/>
+                    <pic:cNvPicPr>
+                      <a:picLocks noChangeAspect="1" noChangeArrowheads="1"/>
+                    </pic:cNvPicPr>
                   </pic:nvPicPr>
                   <pic:blipFill>
                     <a:blip r:embed="rId4">
@@ -86,18 +107,636 @@
                         </a:ext>
                       </a:extLst>
                     </a:blip>
+                    <a:srcRect/>
                     <a:stretch>
                       <a:fillRect/>
                     </a:stretch>
                   </pic:blipFill>
-                  <pic:spPr>
+                  <pic:spPr bwMode="auto">
                     <a:xfrm>
                       <a:off x="0" y="0"/>
-                      <a:ext cx="4958715" cy="3300730"/>
+                      <a:ext cx="876300" cy="876300"/>
                     </a:xfrm>
                     <a:prstGeom prst="rect">
                       <a:avLst/>
                     </a:prstGeom>
+                    <a:noFill/>
+                    <a:ln>
+                      <a:noFill/>
+                    </a:ln>
+                  </pic:spPr>
+                </pic:pic>
+              </a:graphicData>
+            </a:graphic>
+            <wp14:sizeRelH relativeFrom="margin">
+              <wp14:pctWidth>0</wp14:pctWidth>
+            </wp14:sizeRelH>
+            <wp14:sizeRelV relativeFrom="margin">
+              <wp14:pctHeight>0</wp14:pctHeight>
+            </wp14:sizeRelV>
+          </wp:anchor>
+        </w:drawing>
+      </w:r>
+      <w:r>
+        <w:rPr>
+          <w:noProof/>
+        </w:rPr>
+        <w:drawing>
+          <wp:anchor distT="0" distB="0" distL="114300" distR="114300" simplePos="0" relativeHeight="251673600" behindDoc="0" locked="0" layoutInCell="1" allowOverlap="1" wp14:anchorId="1BA204FC" wp14:editId="098E2800">
+            <wp:simplePos x="0" y="0"/>
+            <wp:positionH relativeFrom="column">
+              <wp:posOffset>257175</wp:posOffset>
+            </wp:positionH>
+            <wp:positionV relativeFrom="paragraph">
+              <wp:posOffset>4476750</wp:posOffset>
+            </wp:positionV>
+            <wp:extent cx="771525" cy="771525"/>
+            <wp:effectExtent l="0" t="0" r="9525" b="9525"/>
+            <wp:wrapNone/>
+            <wp:docPr id="648276874" name="Picture 3"/>
+            <wp:cNvGraphicFramePr>
+              <a:graphicFrameLocks xmlns:a="http://schemas.openxmlformats.org/drawingml/2006/main" noChangeAspect="1"/>
+            </wp:cNvGraphicFramePr>
+            <a:graphic xmlns:a="http://schemas.openxmlformats.org/drawingml/2006/main">
+              <a:graphicData uri="http://schemas.openxmlformats.org/drawingml/2006/picture">
+                <pic:pic xmlns:pic="http://schemas.openxmlformats.org/drawingml/2006/picture">
+                  <pic:nvPicPr>
+                    <pic:cNvPr id="0" name="Picture 5"/>
+                    <pic:cNvPicPr>
+                      <a:picLocks noChangeAspect="1" noChangeArrowheads="1"/>
+                    </pic:cNvPicPr>
+                  </pic:nvPicPr>
+                  <pic:blipFill>
+                    <a:blip r:embed="rId5">
+                      <a:extLst>
+                        <a:ext uri="{28A0092B-C50C-407E-A947-70E740481C1C}">
+                          <a14:useLocalDpi xmlns:a14="http://schemas.microsoft.com/office/drawing/2010/main" val="0"/>
+                        </a:ext>
+                      </a:extLst>
+                    </a:blip>
+                    <a:srcRect/>
+                    <a:stretch>
+                      <a:fillRect/>
+                    </a:stretch>
+                  </pic:blipFill>
+                  <pic:spPr bwMode="auto">
+                    <a:xfrm>
+                      <a:off x="0" y="0"/>
+                      <a:ext cx="771525" cy="771525"/>
+                    </a:xfrm>
+                    <a:prstGeom prst="rect">
+                      <a:avLst/>
+                    </a:prstGeom>
+                    <a:noFill/>
+                    <a:ln>
+                      <a:noFill/>
+                    </a:ln>
+                  </pic:spPr>
+                </pic:pic>
+              </a:graphicData>
+            </a:graphic>
+            <wp14:sizeRelH relativeFrom="margin">
+              <wp14:pctWidth>0</wp14:pctWidth>
+            </wp14:sizeRelH>
+            <wp14:sizeRelV relativeFrom="margin">
+              <wp14:pctHeight>0</wp14:pctHeight>
+            </wp14:sizeRelV>
+          </wp:anchor>
+        </w:drawing>
+      </w:r>
+      <w:r>
+        <w:rPr>
+          <w:noProof/>
+        </w:rPr>
+        <w:drawing>
+          <wp:anchor distT="0" distB="0" distL="114300" distR="114300" simplePos="0" relativeHeight="251672576" behindDoc="0" locked="0" layoutInCell="1" allowOverlap="1" wp14:anchorId="204CF072" wp14:editId="05C59FBF">
+            <wp:simplePos x="0" y="0"/>
+            <wp:positionH relativeFrom="column">
+              <wp:posOffset>-476250</wp:posOffset>
+            </wp:positionH>
+            <wp:positionV relativeFrom="paragraph">
+              <wp:posOffset>4914900</wp:posOffset>
+            </wp:positionV>
+            <wp:extent cx="771525" cy="771525"/>
+            <wp:effectExtent l="0" t="0" r="9525" b="9525"/>
+            <wp:wrapNone/>
+            <wp:docPr id="1045637921" name="Picture 3"/>
+            <wp:cNvGraphicFramePr>
+              <a:graphicFrameLocks xmlns:a="http://schemas.openxmlformats.org/drawingml/2006/main" noChangeAspect="1"/>
+            </wp:cNvGraphicFramePr>
+            <a:graphic xmlns:a="http://schemas.openxmlformats.org/drawingml/2006/main">
+              <a:graphicData uri="http://schemas.openxmlformats.org/drawingml/2006/picture">
+                <pic:pic xmlns:pic="http://schemas.openxmlformats.org/drawingml/2006/picture">
+                  <pic:nvPicPr>
+                    <pic:cNvPr id="0" name="Picture 5"/>
+                    <pic:cNvPicPr>
+                      <a:picLocks noChangeAspect="1" noChangeArrowheads="1"/>
+                    </pic:cNvPicPr>
+                  </pic:nvPicPr>
+                  <pic:blipFill>
+                    <a:blip r:embed="rId5">
+                      <a:extLst>
+                        <a:ext uri="{28A0092B-C50C-407E-A947-70E740481C1C}">
+                          <a14:useLocalDpi xmlns:a14="http://schemas.microsoft.com/office/drawing/2010/main" val="0"/>
+                        </a:ext>
+                      </a:extLst>
+                    </a:blip>
+                    <a:srcRect/>
+                    <a:stretch>
+                      <a:fillRect/>
+                    </a:stretch>
+                  </pic:blipFill>
+                  <pic:spPr bwMode="auto">
+                    <a:xfrm>
+                      <a:off x="0" y="0"/>
+                      <a:ext cx="771525" cy="771525"/>
+                    </a:xfrm>
+                    <a:prstGeom prst="rect">
+                      <a:avLst/>
+                    </a:prstGeom>
+                    <a:noFill/>
+                    <a:ln>
+                      <a:noFill/>
+                    </a:ln>
+                  </pic:spPr>
+                </pic:pic>
+              </a:graphicData>
+            </a:graphic>
+            <wp14:sizeRelH relativeFrom="margin">
+              <wp14:pctWidth>0</wp14:pctWidth>
+            </wp14:sizeRelH>
+            <wp14:sizeRelV relativeFrom="margin">
+              <wp14:pctHeight>0</wp14:pctHeight>
+            </wp14:sizeRelV>
+          </wp:anchor>
+        </w:drawing>
+      </w:r>
+      <w:r>
+        <w:rPr>
+          <w:noProof/>
+        </w:rPr>
+        <w:drawing>
+          <wp:anchor distT="0" distB="0" distL="114300" distR="114300" simplePos="0" relativeHeight="251671552" behindDoc="0" locked="0" layoutInCell="1" allowOverlap="1" wp14:anchorId="79CE3326" wp14:editId="2CD2FD1C">
+            <wp:simplePos x="0" y="0"/>
+            <wp:positionH relativeFrom="column">
+              <wp:posOffset>-685800</wp:posOffset>
+            </wp:positionH>
+            <wp:positionV relativeFrom="paragraph">
+              <wp:posOffset>4638040</wp:posOffset>
+            </wp:positionV>
+            <wp:extent cx="771525" cy="771525"/>
+            <wp:effectExtent l="0" t="0" r="9525" b="9525"/>
+            <wp:wrapNone/>
+            <wp:docPr id="1858304609" name="Picture 3"/>
+            <wp:cNvGraphicFramePr>
+              <a:graphicFrameLocks xmlns:a="http://schemas.openxmlformats.org/drawingml/2006/main" noChangeAspect="1"/>
+            </wp:cNvGraphicFramePr>
+            <a:graphic xmlns:a="http://schemas.openxmlformats.org/drawingml/2006/main">
+              <a:graphicData uri="http://schemas.openxmlformats.org/drawingml/2006/picture">
+                <pic:pic xmlns:pic="http://schemas.openxmlformats.org/drawingml/2006/picture">
+                  <pic:nvPicPr>
+                    <pic:cNvPr id="0" name="Picture 5"/>
+                    <pic:cNvPicPr>
+                      <a:picLocks noChangeAspect="1" noChangeArrowheads="1"/>
+                    </pic:cNvPicPr>
+                  </pic:nvPicPr>
+                  <pic:blipFill>
+                    <a:blip r:embed="rId5">
+                      <a:extLst>
+                        <a:ext uri="{28A0092B-C50C-407E-A947-70E740481C1C}">
+                          <a14:useLocalDpi xmlns:a14="http://schemas.microsoft.com/office/drawing/2010/main" val="0"/>
+                        </a:ext>
+                      </a:extLst>
+                    </a:blip>
+                    <a:srcRect/>
+                    <a:stretch>
+                      <a:fillRect/>
+                    </a:stretch>
+                  </pic:blipFill>
+                  <pic:spPr bwMode="auto">
+                    <a:xfrm>
+                      <a:off x="0" y="0"/>
+                      <a:ext cx="771525" cy="771525"/>
+                    </a:xfrm>
+                    <a:prstGeom prst="rect">
+                      <a:avLst/>
+                    </a:prstGeom>
+                    <a:noFill/>
+                    <a:ln>
+                      <a:noFill/>
+                    </a:ln>
+                  </pic:spPr>
+                </pic:pic>
+              </a:graphicData>
+            </a:graphic>
+            <wp14:sizeRelH relativeFrom="margin">
+              <wp14:pctWidth>0</wp14:pctWidth>
+            </wp14:sizeRelH>
+            <wp14:sizeRelV relativeFrom="margin">
+              <wp14:pctHeight>0</wp14:pctHeight>
+            </wp14:sizeRelV>
+          </wp:anchor>
+        </w:drawing>
+      </w:r>
+      <w:r>
+        <w:rPr>
+          <w:noProof/>
+        </w:rPr>
+        <w:drawing>
+          <wp:anchor distT="0" distB="0" distL="114300" distR="114300" simplePos="0" relativeHeight="251669504" behindDoc="0" locked="0" layoutInCell="1" allowOverlap="1" wp14:anchorId="45513D45" wp14:editId="6AE6B545">
+            <wp:simplePos x="0" y="0"/>
+            <wp:positionH relativeFrom="column">
+              <wp:posOffset>4572000</wp:posOffset>
+            </wp:positionH>
+            <wp:positionV relativeFrom="paragraph">
+              <wp:posOffset>4552950</wp:posOffset>
+            </wp:positionV>
+            <wp:extent cx="1714500" cy="676275"/>
+            <wp:effectExtent l="0" t="0" r="0" b="0"/>
+            <wp:wrapNone/>
+            <wp:docPr id="1190747444" name="Picture 6"/>
+            <wp:cNvGraphicFramePr>
+              <a:graphicFrameLocks xmlns:a="http://schemas.openxmlformats.org/drawingml/2006/main" noChangeAspect="1"/>
+            </wp:cNvGraphicFramePr>
+            <a:graphic xmlns:a="http://schemas.openxmlformats.org/drawingml/2006/main">
+              <a:graphicData uri="http://schemas.openxmlformats.org/drawingml/2006/picture">
+                <pic:pic xmlns:pic="http://schemas.openxmlformats.org/drawingml/2006/picture">
+                  <pic:nvPicPr>
+                    <pic:cNvPr id="0" name="Picture 8"/>
+                    <pic:cNvPicPr>
+                      <a:picLocks noChangeAspect="1" noChangeArrowheads="1"/>
+                    </pic:cNvPicPr>
+                  </pic:nvPicPr>
+                  <pic:blipFill rotWithShape="1">
+                    <a:blip r:embed="rId6">
+                      <a:extLst>
+                        <a:ext uri="{28A0092B-C50C-407E-A947-70E740481C1C}">
+                          <a14:useLocalDpi xmlns:a14="http://schemas.microsoft.com/office/drawing/2010/main" val="0"/>
+                        </a:ext>
+                      </a:extLst>
+                    </a:blip>
+                    <a:srcRect b="40833"/>
+                    <a:stretch>
+                      <a:fillRect/>
+                    </a:stretch>
+                  </pic:blipFill>
+                  <pic:spPr bwMode="auto">
+                    <a:xfrm>
+                      <a:off x="0" y="0"/>
+                      <a:ext cx="1714500" cy="676275"/>
+                    </a:xfrm>
+                    <a:prstGeom prst="rect">
+                      <a:avLst/>
+                    </a:prstGeom>
+                    <a:noFill/>
+                    <a:ln>
+                      <a:noFill/>
+                    </a:ln>
+                    <a:extLst>
+                      <a:ext uri="{53640926-AAD7-44D8-BBD7-CCE9431645EC}">
+                        <a14:shadowObscured xmlns:a14="http://schemas.microsoft.com/office/drawing/2010/main"/>
+                      </a:ext>
+                    </a:extLst>
+                  </pic:spPr>
+                </pic:pic>
+              </a:graphicData>
+            </a:graphic>
+            <wp14:sizeRelH relativeFrom="margin">
+              <wp14:pctWidth>0</wp14:pctWidth>
+            </wp14:sizeRelH>
+            <wp14:sizeRelV relativeFrom="margin">
+              <wp14:pctHeight>0</wp14:pctHeight>
+            </wp14:sizeRelV>
+          </wp:anchor>
+        </w:drawing>
+      </w:r>
+      <w:r>
+        <w:rPr>
+          <w:noProof/>
+        </w:rPr>
+        <w:drawing>
+          <wp:anchor distT="0" distB="0" distL="114300" distR="114300" simplePos="0" relativeHeight="251659264" behindDoc="0" locked="0" layoutInCell="1" allowOverlap="1" wp14:anchorId="0A89F81D" wp14:editId="6EAF7BEF">
+            <wp:simplePos x="0" y="0"/>
+            <wp:positionH relativeFrom="column">
+              <wp:posOffset>4391025</wp:posOffset>
+            </wp:positionH>
+            <wp:positionV relativeFrom="paragraph">
+              <wp:posOffset>-800100</wp:posOffset>
+            </wp:positionV>
+            <wp:extent cx="1714500" cy="676275"/>
+            <wp:effectExtent l="0" t="0" r="0" b="0"/>
+            <wp:wrapNone/>
+            <wp:docPr id="799470176" name="Picture 6"/>
+            <wp:cNvGraphicFramePr>
+              <a:graphicFrameLocks xmlns:a="http://schemas.openxmlformats.org/drawingml/2006/main" noChangeAspect="1"/>
+            </wp:cNvGraphicFramePr>
+            <a:graphic xmlns:a="http://schemas.openxmlformats.org/drawingml/2006/main">
+              <a:graphicData uri="http://schemas.openxmlformats.org/drawingml/2006/picture">
+                <pic:pic xmlns:pic="http://schemas.openxmlformats.org/drawingml/2006/picture">
+                  <pic:nvPicPr>
+                    <pic:cNvPr id="0" name="Picture 8"/>
+                    <pic:cNvPicPr>
+                      <a:picLocks noChangeAspect="1" noChangeArrowheads="1"/>
+                    </pic:cNvPicPr>
+                  </pic:nvPicPr>
+                  <pic:blipFill rotWithShape="1">
+                    <a:blip r:embed="rId6">
+                      <a:extLst>
+                        <a:ext uri="{28A0092B-C50C-407E-A947-70E740481C1C}">
+                          <a14:useLocalDpi xmlns:a14="http://schemas.microsoft.com/office/drawing/2010/main" val="0"/>
+                        </a:ext>
+                      </a:extLst>
+                    </a:blip>
+                    <a:srcRect b="40833"/>
+                    <a:stretch>
+                      <a:fillRect/>
+                    </a:stretch>
+                  </pic:blipFill>
+                  <pic:spPr bwMode="auto">
+                    <a:xfrm>
+                      <a:off x="0" y="0"/>
+                      <a:ext cx="1714500" cy="676275"/>
+                    </a:xfrm>
+                    <a:prstGeom prst="rect">
+                      <a:avLst/>
+                    </a:prstGeom>
+                    <a:noFill/>
+                    <a:ln>
+                      <a:noFill/>
+                    </a:ln>
+                    <a:extLst>
+                      <a:ext uri="{53640926-AAD7-44D8-BBD7-CCE9431645EC}">
+                        <a14:shadowObscured xmlns:a14="http://schemas.microsoft.com/office/drawing/2010/main"/>
+                      </a:ext>
+                    </a:extLst>
+                  </pic:spPr>
+                </pic:pic>
+              </a:graphicData>
+            </a:graphic>
+            <wp14:sizeRelH relativeFrom="margin">
+              <wp14:pctWidth>0</wp14:pctWidth>
+            </wp14:sizeRelH>
+            <wp14:sizeRelV relativeFrom="margin">
+              <wp14:pctHeight>0</wp14:pctHeight>
+            </wp14:sizeRelV>
+          </wp:anchor>
+        </w:drawing>
+      </w:r>
+      <w:r>
+        <w:rPr>
+          <w:noProof/>
+        </w:rPr>
+        <w:drawing>
+          <wp:anchor distT="0" distB="0" distL="114300" distR="114300" simplePos="0" relativeHeight="251667456" behindDoc="0" locked="0" layoutInCell="1" allowOverlap="1" wp14:anchorId="29F5E5CB" wp14:editId="309F769A">
+            <wp:simplePos x="0" y="0"/>
+            <wp:positionH relativeFrom="column">
+              <wp:posOffset>419100</wp:posOffset>
+            </wp:positionH>
+            <wp:positionV relativeFrom="paragraph">
+              <wp:posOffset>-942975</wp:posOffset>
+            </wp:positionV>
+            <wp:extent cx="771525" cy="771525"/>
+            <wp:effectExtent l="0" t="0" r="9525" b="9525"/>
+            <wp:wrapNone/>
+            <wp:docPr id="1936987382" name="Picture 3"/>
+            <wp:cNvGraphicFramePr>
+              <a:graphicFrameLocks xmlns:a="http://schemas.openxmlformats.org/drawingml/2006/main" noChangeAspect="1"/>
+            </wp:cNvGraphicFramePr>
+            <a:graphic xmlns:a="http://schemas.openxmlformats.org/drawingml/2006/main">
+              <a:graphicData uri="http://schemas.openxmlformats.org/drawingml/2006/picture">
+                <pic:pic xmlns:pic="http://schemas.openxmlformats.org/drawingml/2006/picture">
+                  <pic:nvPicPr>
+                    <pic:cNvPr id="0" name="Picture 5"/>
+                    <pic:cNvPicPr>
+                      <a:picLocks noChangeAspect="1" noChangeArrowheads="1"/>
+                    </pic:cNvPicPr>
+                  </pic:nvPicPr>
+                  <pic:blipFill>
+                    <a:blip r:embed="rId5">
+                      <a:extLst>
+                        <a:ext uri="{28A0092B-C50C-407E-A947-70E740481C1C}">
+                          <a14:useLocalDpi xmlns:a14="http://schemas.microsoft.com/office/drawing/2010/main" val="0"/>
+                        </a:ext>
+                      </a:extLst>
+                    </a:blip>
+                    <a:srcRect/>
+                    <a:stretch>
+                      <a:fillRect/>
+                    </a:stretch>
+                  </pic:blipFill>
+                  <pic:spPr bwMode="auto">
+                    <a:xfrm>
+                      <a:off x="0" y="0"/>
+                      <a:ext cx="771525" cy="771525"/>
+                    </a:xfrm>
+                    <a:prstGeom prst="rect">
+                      <a:avLst/>
+                    </a:prstGeom>
+                    <a:noFill/>
+                    <a:ln>
+                      <a:noFill/>
+                    </a:ln>
+                  </pic:spPr>
+                </pic:pic>
+              </a:graphicData>
+            </a:graphic>
+            <wp14:sizeRelH relativeFrom="margin">
+              <wp14:pctWidth>0</wp14:pctWidth>
+            </wp14:sizeRelH>
+            <wp14:sizeRelV relativeFrom="margin">
+              <wp14:pctHeight>0</wp14:pctHeight>
+            </wp14:sizeRelV>
+          </wp:anchor>
+        </w:drawing>
+      </w:r>
+      <w:r>
+        <w:rPr>
+          <w:noProof/>
+        </w:rPr>
+        <w:drawing>
+          <wp:anchor distT="0" distB="0" distL="114300" distR="114300" simplePos="0" relativeHeight="251665408" behindDoc="0" locked="0" layoutInCell="1" allowOverlap="1" wp14:anchorId="284B59B6" wp14:editId="14242E30">
+            <wp:simplePos x="0" y="0"/>
+            <wp:positionH relativeFrom="column">
+              <wp:posOffset>-314325</wp:posOffset>
+            </wp:positionH>
+            <wp:positionV relativeFrom="paragraph">
+              <wp:posOffset>-504825</wp:posOffset>
+            </wp:positionV>
+            <wp:extent cx="771525" cy="771525"/>
+            <wp:effectExtent l="0" t="0" r="9525" b="9525"/>
+            <wp:wrapNone/>
+            <wp:docPr id="1528309950" name="Picture 3"/>
+            <wp:cNvGraphicFramePr>
+              <a:graphicFrameLocks xmlns:a="http://schemas.openxmlformats.org/drawingml/2006/main" noChangeAspect="1"/>
+            </wp:cNvGraphicFramePr>
+            <a:graphic xmlns:a="http://schemas.openxmlformats.org/drawingml/2006/main">
+              <a:graphicData uri="http://schemas.openxmlformats.org/drawingml/2006/picture">
+                <pic:pic xmlns:pic="http://schemas.openxmlformats.org/drawingml/2006/picture">
+                  <pic:nvPicPr>
+                    <pic:cNvPr id="0" name="Picture 5"/>
+                    <pic:cNvPicPr>
+                      <a:picLocks noChangeAspect="1" noChangeArrowheads="1"/>
+                    </pic:cNvPicPr>
+                  </pic:nvPicPr>
+                  <pic:blipFill>
+                    <a:blip r:embed="rId5">
+                      <a:extLst>
+                        <a:ext uri="{28A0092B-C50C-407E-A947-70E740481C1C}">
+                          <a14:useLocalDpi xmlns:a14="http://schemas.microsoft.com/office/drawing/2010/main" val="0"/>
+                        </a:ext>
+                      </a:extLst>
+                    </a:blip>
+                    <a:srcRect/>
+                    <a:stretch>
+                      <a:fillRect/>
+                    </a:stretch>
+                  </pic:blipFill>
+                  <pic:spPr bwMode="auto">
+                    <a:xfrm>
+                      <a:off x="0" y="0"/>
+                      <a:ext cx="771525" cy="771525"/>
+                    </a:xfrm>
+                    <a:prstGeom prst="rect">
+                      <a:avLst/>
+                    </a:prstGeom>
+                    <a:noFill/>
+                    <a:ln>
+                      <a:noFill/>
+                    </a:ln>
+                  </pic:spPr>
+                </pic:pic>
+              </a:graphicData>
+            </a:graphic>
+            <wp14:sizeRelH relativeFrom="margin">
+              <wp14:pctWidth>0</wp14:pctWidth>
+            </wp14:sizeRelH>
+            <wp14:sizeRelV relativeFrom="margin">
+              <wp14:pctHeight>0</wp14:pctHeight>
+            </wp14:sizeRelV>
+          </wp:anchor>
+        </w:drawing>
+      </w:r>
+      <w:r>
+        <w:rPr>
+          <w:noProof/>
+        </w:rPr>
+        <w:drawing>
+          <wp:anchor distT="0" distB="0" distL="114300" distR="114300" simplePos="0" relativeHeight="251663360" behindDoc="0" locked="0" layoutInCell="1" allowOverlap="1" wp14:anchorId="28FA1937" wp14:editId="5854902E">
+            <wp:simplePos x="0" y="0"/>
+            <wp:positionH relativeFrom="column">
+              <wp:posOffset>-523875</wp:posOffset>
+            </wp:positionH>
+            <wp:positionV relativeFrom="paragraph">
+              <wp:posOffset>-781685</wp:posOffset>
+            </wp:positionV>
+            <wp:extent cx="771525" cy="771525"/>
+            <wp:effectExtent l="0" t="0" r="9525" b="9525"/>
+            <wp:wrapNone/>
+            <wp:docPr id="1292655679" name="Picture 3"/>
+            <wp:cNvGraphicFramePr>
+              <a:graphicFrameLocks xmlns:a="http://schemas.openxmlformats.org/drawingml/2006/main" noChangeAspect="1"/>
+            </wp:cNvGraphicFramePr>
+            <a:graphic xmlns:a="http://schemas.openxmlformats.org/drawingml/2006/main">
+              <a:graphicData uri="http://schemas.openxmlformats.org/drawingml/2006/picture">
+                <pic:pic xmlns:pic="http://schemas.openxmlformats.org/drawingml/2006/picture">
+                  <pic:nvPicPr>
+                    <pic:cNvPr id="0" name="Picture 5"/>
+                    <pic:cNvPicPr>
+                      <a:picLocks noChangeAspect="1" noChangeArrowheads="1"/>
+                    </pic:cNvPicPr>
+                  </pic:nvPicPr>
+                  <pic:blipFill>
+                    <a:blip r:embed="rId5">
+                      <a:extLst>
+                        <a:ext uri="{28A0092B-C50C-407E-A947-70E740481C1C}">
+                          <a14:useLocalDpi xmlns:a14="http://schemas.microsoft.com/office/drawing/2010/main" val="0"/>
+                        </a:ext>
+                      </a:extLst>
+                    </a:blip>
+                    <a:srcRect/>
+                    <a:stretch>
+                      <a:fillRect/>
+                    </a:stretch>
+                  </pic:blipFill>
+                  <pic:spPr bwMode="auto">
+                    <a:xfrm>
+                      <a:off x="0" y="0"/>
+                      <a:ext cx="771525" cy="771525"/>
+                    </a:xfrm>
+                    <a:prstGeom prst="rect">
+                      <a:avLst/>
+                    </a:prstGeom>
+                    <a:noFill/>
+                    <a:ln>
+                      <a:noFill/>
+                    </a:ln>
+                  </pic:spPr>
+                </pic:pic>
+              </a:graphicData>
+            </a:graphic>
+            <wp14:sizeRelH relativeFrom="margin">
+              <wp14:pctWidth>0</wp14:pctWidth>
+            </wp14:sizeRelH>
+            <wp14:sizeRelV relativeFrom="margin">
+              <wp14:pctHeight>0</wp14:pctHeight>
+            </wp14:sizeRelV>
+          </wp:anchor>
+        </w:drawing>
+      </w:r>
+      <w:r>
+        <w:rPr>
+          <w:noProof/>
+        </w:rPr>
+        <w:drawing>
+          <wp:anchor distT="0" distB="0" distL="114300" distR="114300" simplePos="0" relativeHeight="251658240" behindDoc="0" locked="0" layoutInCell="1" allowOverlap="1" wp14:anchorId="4CA4F772" wp14:editId="1DF7C953">
+            <wp:simplePos x="0" y="0"/>
+            <wp:positionH relativeFrom="column">
+              <wp:posOffset>-66675</wp:posOffset>
+            </wp:positionH>
+            <wp:positionV relativeFrom="paragraph">
+              <wp:posOffset>5286375</wp:posOffset>
+            </wp:positionV>
+            <wp:extent cx="5731510" cy="3556635"/>
+            <wp:effectExtent l="0" t="0" r="2540" b="5715"/>
+            <wp:wrapNone/>
+            <wp:docPr id="845145488" name="Picture 2"/>
+            <wp:cNvGraphicFramePr>
+              <a:graphicFrameLocks xmlns:a="http://schemas.openxmlformats.org/drawingml/2006/main" noChangeAspect="1"/>
+            </wp:cNvGraphicFramePr>
+            <a:graphic xmlns:a="http://schemas.openxmlformats.org/drawingml/2006/main">
+              <a:graphicData uri="http://schemas.openxmlformats.org/drawingml/2006/picture">
+                <pic:pic xmlns:pic="http://schemas.openxmlformats.org/drawingml/2006/picture">
+                  <pic:nvPicPr>
+                    <pic:cNvPr id="0" name="Picture 3"/>
+                    <pic:cNvPicPr>
+                      <a:picLocks noChangeAspect="1" noChangeArrowheads="1"/>
+                    </pic:cNvPicPr>
+                  </pic:nvPicPr>
+                  <pic:blipFill>
+                    <a:blip r:embed="rId7">
+                      <a:extLst>
+                        <a:ext uri="{28A0092B-C50C-407E-A947-70E740481C1C}">
+                          <a14:useLocalDpi xmlns:a14="http://schemas.microsoft.com/office/drawing/2010/main" val="0"/>
+                        </a:ext>
+                      </a:extLst>
+                    </a:blip>
+                    <a:srcRect/>
+                    <a:stretch>
+                      <a:fillRect/>
+                    </a:stretch>
+                  </pic:blipFill>
+                  <pic:spPr bwMode="auto">
+                    <a:xfrm>
+                      <a:off x="0" y="0"/>
+                      <a:ext cx="5731510" cy="3556635"/>
+                    </a:xfrm>
+                    <a:prstGeom prst="rect">
+                      <a:avLst/>
+                    </a:prstGeom>
+                    <a:noFill/>
+                    <a:ln>
+                      <a:noFill/>
+                    </a:ln>
                   </pic:spPr>
                 </pic:pic>
               </a:graphicData>
@@ -109,10 +748,63 @@
         <w:rPr>
           <w:noProof/>
         </w:rPr>
+        <w:drawing>
+          <wp:inline distT="0" distB="0" distL="0" distR="0" wp14:anchorId="2290FC00" wp14:editId="163FBAAA">
+            <wp:extent cx="5731510" cy="3556635"/>
+            <wp:effectExtent l="0" t="0" r="2540" b="5715"/>
+            <wp:docPr id="1268882158" name="Picture 1"/>
+            <wp:cNvGraphicFramePr>
+              <a:graphicFrameLocks xmlns:a="http://schemas.openxmlformats.org/drawingml/2006/main" noChangeAspect="1"/>
+            </wp:cNvGraphicFramePr>
+            <a:graphic xmlns:a="http://schemas.openxmlformats.org/drawingml/2006/main">
+              <a:graphicData uri="http://schemas.openxmlformats.org/drawingml/2006/picture">
+                <pic:pic xmlns:pic="http://schemas.openxmlformats.org/drawingml/2006/picture">
+                  <pic:nvPicPr>
+                    <pic:cNvPr id="0" name="Picture 1"/>
+                    <pic:cNvPicPr>
+                      <a:picLocks noChangeAspect="1" noChangeArrowheads="1"/>
+                    </pic:cNvPicPr>
+                  </pic:nvPicPr>
+                  <pic:blipFill>
+                    <a:blip r:embed="rId7">
+                      <a:extLst>
+                        <a:ext uri="{28A0092B-C50C-407E-A947-70E740481C1C}">
+                          <a14:useLocalDpi xmlns:a14="http://schemas.microsoft.com/office/drawing/2010/main" val="0"/>
+                        </a:ext>
+                      </a:extLst>
+                    </a:blip>
+                    <a:srcRect/>
+                    <a:stretch>
+                      <a:fillRect/>
+                    </a:stretch>
+                  </pic:blipFill>
+                  <pic:spPr bwMode="auto">
+                    <a:xfrm>
+                      <a:off x="0" y="0"/>
+                      <a:ext cx="5731510" cy="3556635"/>
+                    </a:xfrm>
+                    <a:prstGeom prst="rect">
+                      <a:avLst/>
+                    </a:prstGeom>
+                    <a:noFill/>
+                    <a:ln>
+                      <a:noFill/>
+                    </a:ln>
+                  </pic:spPr>
+                </pic:pic>
+              </a:graphicData>
+            </a:graphic>
+          </wp:inline>
+        </w:drawing>
+      </w:r>
+      <w:r>
+        <w:rPr>
+          <w:noProof/>
+        </w:rPr>
         <mc:AlternateContent>
           <mc:Choice Requires="wps">
             <w:drawing>
-              <wp:inline distT="0" distB="0" distL="0" distR="0" wp14:anchorId="6D2816D5" wp14:editId="405262E7">
+              <wp:inline distT="0" distB="0" distL="0" distR="0" wp14:anchorId="6D2816D5" wp14:editId="4C3A9AD4">
                 <wp:extent cx="304800" cy="304800"/>
                 <wp:effectExtent l="0" t="0" r="0" b="0"/>
                 <wp:docPr id="1589896714" name="Rectangle 1"/>
@@ -168,7 +860,7 @@
           </mc:Choice>
           <mc:Fallback>
             <w:pict>
-              <v:rect w14:anchorId="4C2EB35A" id="Rectangle 1" o:spid="_x0000_s1026" style="width:24pt;height:24pt;visibility:visible;mso-wrap-style:square;mso-left-percent:-10001;mso-top-percent:-10001;mso-position-horizontal:absolute;mso-position-horizontal-relative:char;mso-position-vertical:absolute;mso-position-vertical-relative:line;mso-left-percent:-10001;mso-top-percent:-10001;v-text-anchor:top" o:gfxdata="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" filled="f" stroked="f">
+              <v:rect w14:anchorId="1DD19134" id="Rectangle 1" o:spid="_x0000_s1026" style="width:24pt;height:24pt;visibility:visible;mso-wrap-style:square;mso-left-percent:-10001;mso-top-percent:-10001;mso-position-horizontal:absolute;mso-position-horizontal-relative:char;mso-position-vertical:absolute;mso-position-vertical-relative:line;mso-left-percent:-10001;mso-top-percent:-10001;v-text-anchor:top" o:gfxdata="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" filled="f" stroked="f">
                 <o:lock v:ext="edit" aspectratio="t"/>
                 <w10:anchorlock/>
               </v:rect>

</xml_diff>